<commit_message>
Fix AI Confidence circle SVG clipping at top
</commit_message>
<xml_diff>
--- a/SATHVIKA_BOINA_THE_DEAL_BRIEF_Prompt_Engineering_&_AI_Workflow_Documentation.docx
+++ b/SATHVIKA_BOINA_THE_DEAL_BRIEF_Prompt_Engineering_&_AI_Workflow_Documentation.docx
@@ -3822,6 +3822,20 @@
     </w:p>
     <w:bookmarkEnd w:id="44"/>
     <w:bookmarkEnd w:id="45"/>
+    <w:p/>
+    <w:p>
+      <w:pPr>
+        <w:pStyle w:val="Heading2"/>
+      </w:pPr>
+      <w:r>
+        <w:t>Latest Update: Vercel Frontend Simulation</w:t>
+      </w:r>
+    </w:p>
+    <w:p>
+      <w:r>
+        <w:t>Due to Vercel Serverless Function edge timeout and streaming buffering latency, the workflow stream was entirely refactored to be simulated perfectly on the frontend. The Next.js frontend now uses a completely native React setInterval to transition between the 8 agents in exactly 300ms intervals (2.4 seconds total), bypassing network latency while still using LocalStorage to securely pass data to the final Brief page.</w:t>
+      </w:r>
+    </w:p>
     <w:sectPr>
       <w:footnotePr>
         <w:numRestart w:val="eachSect"/>

</xml_diff>